<commit_message>
Finalize APV2 release papers and citation metadata
</commit_message>
<xml_diff>
--- a/paper_artifacts/release_20260614/APV2_论文_白箱预测行动闭环架构_20260614.docx
+++ b/paper_artifacts/release_20260614/APV2_论文_白箱预测行动闭环架构_20260614.docx
@@ -4213,7 +4213,181 @@
           <w:rFonts w:ascii="Microsoft YaHei" w:hAnsi="Microsoft YaHei" w:eastAsia="Microsoft YaHei"/>
           <w:sz w:val="32"/>
         </w:rPr>
-        <w:t>7. 适用边界与下一步</w:t>
+        <w:t>7. 数据、代码与复现可用性</w:t>
+      </w:r>
+    </w:p>
+    <w:p>
+      <w:pPr>
+        <w:ind w:firstLine="420"/>
+      </w:pPr>
+      <w:r>
+        <w:rPr>
+          <w:rFonts w:ascii="Microsoft YaHei" w:hAnsi="Microsoft YaHei" w:eastAsia="Microsoft YaHei"/>
+          <w:sz w:val="21"/>
+        </w:rPr>
+        <w:t>APV2 发布版采用三个公开仓库和一个统一 tag 固定代码、文档与实验产物。</w:t>
+      </w:r>
+      <w:r>
+        <w:rPr>
+          <w:rFonts w:ascii="Consolas" w:hAnsi="Consolas" w:eastAsia="Consolas"/>
+          <w:sz w:val="21"/>
+        </w:rPr>
+        <w:t>Artificial-PsyArch-V2</w:t>
+      </w:r>
+      <w:r>
+        <w:rPr>
+          <w:rFonts w:ascii="Microsoft YaHei" w:hAnsi="Microsoft YaHei" w:eastAsia="Microsoft YaHei"/>
+          <w:sz w:val="21"/>
+        </w:rPr>
+        <w:t xml:space="preserve"> 承载 AP-Core runtime、机制实验、短主文、长篇技术报告和图表; </w:t>
+      </w:r>
+      <w:r>
+        <w:rPr>
+          <w:rFonts w:ascii="Consolas" w:hAnsi="Consolas" w:eastAsia="Consolas"/>
+          <w:sz w:val="21"/>
+        </w:rPr>
+        <w:t>APV2-GL-OpenWorld-Chinese</w:t>
+      </w:r>
+      <w:r>
+        <w:rPr>
+          <w:rFonts w:ascii="Microsoft YaHei" w:hAnsi="Microsoft YaHei" w:eastAsia="Microsoft YaHei"/>
+          <w:sz w:val="21"/>
+        </w:rPr>
+        <w:t xml:space="preserve"> 承载 GL 学习协议、开放中文对话课程、teacher-off/no-leakage 验证和技能包材料; </w:t>
+      </w:r>
+      <w:r>
+        <w:rPr>
+          <w:rFonts w:ascii="Consolas" w:hAnsi="Consolas" w:eastAsia="Consolas"/>
+          <w:sz w:val="21"/>
+        </w:rPr>
+        <w:t>APV2-Reproduction-Artifacts</w:t>
+      </w:r>
+      <w:r>
+        <w:rPr>
+          <w:rFonts w:ascii="Microsoft YaHei" w:hAnsi="Microsoft YaHei" w:eastAsia="Microsoft YaHei"/>
+          <w:sz w:val="21"/>
+        </w:rPr>
+        <w:t xml:space="preserve"> 承载冻结 artifact、manifest、SHA-256、复跑命令和第三方复现整理。第三方 Rust 复现仓库 </w:t>
+      </w:r>
+      <w:r>
+        <w:rPr>
+          <w:rFonts w:ascii="Consolas" w:hAnsi="Consolas" w:eastAsia="Consolas"/>
+          <w:sz w:val="21"/>
+        </w:rPr>
+        <w:t>ACG-j/artificial_psyarch</w:t>
+      </w:r>
+      <w:r>
+        <w:rPr>
+          <w:rFonts w:ascii="Microsoft YaHei" w:hAnsi="Microsoft YaHei" w:eastAsia="Microsoft YaHei"/>
+          <w:sz w:val="21"/>
+        </w:rPr>
+        <w:t xml:space="preserve"> 作为独立参考实现保留。</w:t>
+      </w:r>
+    </w:p>
+    <w:p>
+      <w:pPr>
+        <w:ind w:firstLine="420"/>
+      </w:pPr>
+      <w:r>
+        <w:rPr>
+          <w:rFonts w:ascii="Microsoft YaHei" w:hAnsi="Microsoft YaHei" w:eastAsia="Microsoft YaHei"/>
+          <w:sz w:val="21"/>
+        </w:rPr>
+        <w:t xml:space="preserve">复现锚点由三层组成: 公开仓库 tag </w:t>
+      </w:r>
+      <w:r>
+        <w:rPr>
+          <w:rFonts w:ascii="Consolas" w:hAnsi="Consolas" w:eastAsia="Consolas"/>
+          <w:sz w:val="21"/>
+        </w:rPr>
+        <w:t>apv2-release-20260614-final-longreport</w:t>
+      </w:r>
+      <w:r>
+        <w:rPr>
+          <w:rFonts w:ascii="Microsoft YaHei" w:hAnsi="Microsoft YaHei" w:eastAsia="Microsoft YaHei"/>
+          <w:sz w:val="21"/>
+        </w:rPr>
+        <w:t xml:space="preserve">, 各仓库内的 </w:t>
+      </w:r>
+      <w:r>
+        <w:rPr>
+          <w:rFonts w:ascii="Consolas" w:hAnsi="Consolas" w:eastAsia="Consolas"/>
+          <w:sz w:val="21"/>
+        </w:rPr>
+        <w:t>PUBLIC_STAGING_MANIFEST.json</w:t>
+      </w:r>
+      <w:r>
+        <w:rPr>
+          <w:rFonts w:ascii="Microsoft YaHei" w:hAnsi="Microsoft YaHei" w:eastAsia="Microsoft YaHei"/>
+          <w:sz w:val="21"/>
+        </w:rPr>
+        <w:t xml:space="preserve">, 以及外层 </w:t>
+      </w:r>
+      <w:r>
+        <w:rPr>
+          <w:rFonts w:ascii="Consolas" w:hAnsi="Consolas" w:eastAsia="Consolas"/>
+          <w:sz w:val="21"/>
+        </w:rPr>
+        <w:t>PUBLIC_REPO_STAGING_SUMMARY.json</w:t>
+      </w:r>
+      <w:r>
+        <w:rPr>
+          <w:rFonts w:ascii="Microsoft YaHei" w:hAnsi="Microsoft YaHei" w:eastAsia="Microsoft YaHei"/>
+          <w:sz w:val="21"/>
+        </w:rPr>
+        <w:t xml:space="preserve"> 中记录的 zip SHA-256。发布文档本身也由 </w:t>
+      </w:r>
+      <w:r>
+        <w:rPr>
+          <w:rFonts w:ascii="Consolas" w:hAnsi="Consolas" w:eastAsia="Consolas"/>
+          <w:sz w:val="21"/>
+        </w:rPr>
+        <w:t>paper_artifacts/release_20260614/release_manifest_20260614.json</w:t>
+      </w:r>
+      <w:r>
+        <w:rPr>
+          <w:rFonts w:ascii="Microsoft YaHei" w:hAnsi="Microsoft YaHei" w:eastAsia="Microsoft YaHei"/>
+          <w:sz w:val="21"/>
+        </w:rPr>
+        <w:t xml:space="preserve"> 记录 Word/PDF 文件的 bytes 与 SHA-256。这样读者可以从论文主张追溯到仓库文件、实验输出、文档版本和外发压缩包。</w:t>
+      </w:r>
+    </w:p>
+    <w:p>
+      <w:pPr>
+        <w:ind w:firstLine="420"/>
+      </w:pPr>
+      <w:r>
+        <w:rPr>
+          <w:rFonts w:ascii="Microsoft YaHei" w:hAnsi="Microsoft YaHei" w:eastAsia="Microsoft YaHei"/>
+          <w:sz w:val="21"/>
+        </w:rPr>
+        <w:t xml:space="preserve">代码以 </w:t>
+      </w:r>
+      <w:r>
+        <w:rPr>
+          <w:rFonts w:ascii="Consolas" w:hAnsi="Consolas" w:eastAsia="Consolas"/>
+          <w:sz w:val="21"/>
+        </w:rPr>
+        <w:t>APV2 Public Research License v2026-06-14</w:t>
+      </w:r>
+      <w:r>
+        <w:rPr>
+          <w:rFonts w:ascii="Microsoft YaHei" w:hAnsi="Microsoft YaHei" w:eastAsia="Microsoft YaHei"/>
+          <w:sz w:val="21"/>
+        </w:rPr>
+        <w:t xml:space="preserve"> 发布为 source-available public research preview。该许可证允许公开阅读、克隆、本地复验、非商业研究评估和合理引用，同时保留商业使用、模型训练或评测数据复用、数据集/技能包再打包、产品部署和官方衍生版本声明等权限边界。</w:t>
+      </w:r>
+    </w:p>
+    <w:p>
+      <w:pPr>
+        <w:pStyle w:val="Heading1"/>
+      </w:pPr>
+      <w:r>
+        <w:rPr>
+          <w:rFonts w:ascii="Microsoft YaHei" w:hAnsi="Microsoft YaHei" w:eastAsia="Microsoft YaHei"/>
+          <w:sz w:val="32"/>
+        </w:rPr>
+        <w:t>8. 适用边界与下一步</w:t>
       </w:r>
     </w:p>
     <w:p>
@@ -4261,7 +4435,7 @@
           <w:rFonts w:ascii="Microsoft YaHei" w:hAnsi="Microsoft YaHei" w:eastAsia="Microsoft YaHei"/>
           <w:sz w:val="32"/>
         </w:rPr>
-        <w:t>8. 结论</w:t>
+        <w:t>9. 结论</w:t>
       </w:r>
     </w:p>
     <w:p>

</xml_diff>